<commit_message>
menambahkan trialerror.ipynb untuk uji coba model
</commit_message>
<xml_diff>
--- a/Laporan Tubes Algo.docx
+++ b/Laporan Tubes Algo.docx
@@ -490,8 +490,27 @@
           <w:numId w:val="0"/>
         </w:numPr>
         <w:jc w:val="center"/>
+        <w:sectPr>
+          <w:footerReference w:type="default" r:id="rId9"/>
+          <w:pgSz w:w="12240" w:h="15840"/>
+          <w:pgMar w:top="1701" w:right="1701" w:bottom="1701" w:left="2268" w:header="709" w:footer="709" w:gutter="0"/>
+          <w:pgNumType w:start="1"/>
+          <w:cols w:space="708"/>
+          <w:titlePg/>
+          <w:docGrid w:linePitch="360"/>
+        </w:sectPr>
       </w:pPr>
       <w:bookmarkStart w:id="0" w:name="_Toc232684389"/>
+    </w:p>
+    <w:p>
+      <w:pPr>
+        <w:pStyle w:val="Judul1"/>
+        <w:numPr>
+          <w:ilvl w:val="0"/>
+          <w:numId w:val="0"/>
+        </w:numPr>
+        <w:jc w:val="center"/>
+      </w:pPr>
       <w:r>
         <w:lastRenderedPageBreak/>
         <w:t>KATA PENGANTAR</w:t>
@@ -901,6 +920,34 @@
           <w:lang w:val="id-ID"/>
         </w:rPr>
         <w:t>.</w:t>
+      </w:r>
+    </w:p>
+    <w:p>
+      <w:pPr>
+        <w:jc w:val="right"/>
+        <w:rPr>
+          <w:lang w:val="id-ID"/>
+        </w:rPr>
+      </w:pPr>
+      <w:r>
+        <w:rPr>
+          <w:lang w:val="id-ID"/>
+        </w:rPr>
+        <w:t xml:space="preserve">Bandung, </w:t>
+      </w:r>
+      <w:proofErr w:type="spellStart"/>
+      <w:r>
+        <w:rPr>
+          <w:lang w:val="id-ID"/>
+        </w:rPr>
+        <w:t>juli</w:t>
+      </w:r>
+      <w:proofErr w:type="spellEnd"/>
+      <w:r>
+        <w:rPr>
+          <w:lang w:val="id-ID"/>
+        </w:rPr>
+        <w:t xml:space="preserve"> 2026</w:t>
       </w:r>
     </w:p>
     <w:p>
@@ -999,7 +1046,7 @@
         <w:rPr>
           <w:noProof/>
         </w:rPr>
-        <w:t>2</w:t>
+        <w:t>i</w:t>
       </w:r>
       <w:r>
         <w:rPr>
@@ -1063,7 +1110,7 @@
         <w:rPr>
           <w:noProof/>
         </w:rPr>
-        <w:t>3</w:t>
+        <w:t>ii</w:t>
       </w:r>
       <w:r>
         <w:rPr>
@@ -1128,7 +1175,7 @@
         <w:rPr>
           <w:noProof/>
         </w:rPr>
-        <w:t>4</w:t>
+        <w:t>1</w:t>
       </w:r>
       <w:r>
         <w:rPr>
@@ -1205,7 +1252,7 @@
         <w:rPr>
           <w:noProof/>
         </w:rPr>
-        <w:t>4</w:t>
+        <w:t>1</w:t>
       </w:r>
       <w:r>
         <w:rPr>
@@ -1282,7 +1329,7 @@
         <w:rPr>
           <w:noProof/>
         </w:rPr>
-        <w:t>7</w:t>
+        <w:t>4</w:t>
       </w:r>
       <w:r>
         <w:rPr>
@@ -1361,7 +1408,7 @@
         <w:rPr>
           <w:noProof/>
         </w:rPr>
-        <w:t>7</w:t>
+        <w:t>4</w:t>
       </w:r>
       <w:r>
         <w:rPr>
@@ -1426,7 +1473,7 @@
         <w:rPr>
           <w:noProof/>
         </w:rPr>
-        <w:t>9</w:t>
+        <w:t>8</w:t>
       </w:r>
       <w:r>
         <w:rPr>
@@ -1451,6 +1498,23 @@
         <w:rPr>
           <w:bCs/>
         </w:rPr>
+        <w:sectPr>
+          <w:pgSz w:w="12240" w:h="15840"/>
+          <w:pgMar w:top="1701" w:right="1701" w:bottom="1701" w:left="2268" w:header="709" w:footer="709" w:gutter="0"/>
+          <w:pgNumType w:fmt="lowerRoman" w:start="1"/>
+          <w:cols w:space="708"/>
+          <w:docGrid w:linePitch="360"/>
+        </w:sectPr>
+      </w:pPr>
+    </w:p>
+    <w:p>
+      <w:pPr>
+        <w:pStyle w:val="Judul1"/>
+        <w:ind w:left="0" w:firstLine="0"/>
+        <w:jc w:val="center"/>
+        <w:rPr>
+          <w:bCs/>
+        </w:rPr>
       </w:pPr>
       <w:r>
         <w:rPr>
@@ -2977,6 +3041,7 @@
       </w:r>
       <w:proofErr w:type="spellStart"/>
       <w:r>
+        <w:lastRenderedPageBreak/>
         <w:t>lebih</w:t>
       </w:r>
       <w:proofErr w:type="spellEnd"/>
@@ -3041,7 +3106,6 @@
       </w:r>
       <w:proofErr w:type="spellStart"/>
       <w:r>
-        <w:lastRenderedPageBreak/>
         <w:t>perilaku</w:t>
       </w:r>
       <w:proofErr w:type="spellEnd"/>
@@ -6604,9 +6668,21 @@
         <w:rPr>
           <w:lang w:val="id-ID" w:eastAsia="id-ID"/>
         </w:rPr>
-        <w:t>RUMUSAN MASALAH</w:t>
+        <w:t>TUJUAN</w:t>
+      </w:r>
+      <w:r>
+        <w:rPr>
+          <w:lang w:val="id-ID" w:eastAsia="id-ID"/>
+        </w:rPr>
+        <w:t xml:space="preserve"> </w:t>
       </w:r>
       <w:bookmarkEnd w:id="5"/>
+      <w:r>
+        <w:rPr>
+          <w:lang w:val="id-ID" w:eastAsia="id-ID"/>
+        </w:rPr>
+        <w:t>PENELITIAN</w:t>
+      </w:r>
       <w:r>
         <w:rPr>
           <w:lang w:val="id-ID" w:eastAsia="id-ID"/>
@@ -6987,6 +7063,162 @@
           <w:lang w:val="id-ID" w:eastAsia="id-ID"/>
         </w:rPr>
         <w:t>.</w:t>
+      </w:r>
+    </w:p>
+    <w:p>
+      <w:pPr>
+        <w:spacing w:after="160" w:line="259" w:lineRule="auto"/>
+        <w:ind w:firstLine="0"/>
+        <w:jc w:val="left"/>
+        <w:rPr>
+          <w:lang w:val="id-ID" w:eastAsia="id-ID"/>
+        </w:rPr>
+      </w:pPr>
+      <w:r>
+        <w:rPr>
+          <w:lang w:val="id-ID" w:eastAsia="id-ID"/>
+        </w:rPr>
+        <w:br w:type="page"/>
+      </w:r>
+    </w:p>
+    <w:p>
+      <w:pPr>
+        <w:pStyle w:val="Judul1"/>
+        <w:ind w:left="0" w:firstLine="0"/>
+        <w:jc w:val="center"/>
+        <w:rPr>
+          <w:lang w:eastAsia="id-ID"/>
+        </w:rPr>
+      </w:pPr>
+      <w:r>
+        <w:rPr>
+          <w:lang w:eastAsia="id-ID"/>
+        </w:rPr>
+        <w:lastRenderedPageBreak/>
+        <w:br/>
+        <w:t>ISI</w:t>
+      </w:r>
+    </w:p>
+    <w:p>
+      <w:pPr>
+        <w:pStyle w:val="Judul2"/>
+        <w:rPr>
+          <w:lang w:eastAsia="id-ID"/>
+        </w:rPr>
+      </w:pPr>
+      <w:r>
+        <w:rPr>
+          <w:lang w:eastAsia="id-ID"/>
+        </w:rPr>
+        <w:t>PENGAMBILAN DATA</w:t>
+      </w:r>
+    </w:p>
+    <w:p>
+      <w:pPr>
+        <w:pStyle w:val="Judul2"/>
+        <w:rPr>
+          <w:lang w:eastAsia="id-ID"/>
+        </w:rPr>
+      </w:pPr>
+      <w:r>
+        <w:rPr>
+          <w:lang w:eastAsia="id-ID"/>
+        </w:rPr>
+        <w:t>PENGUMPULAN DATA</w:t>
+      </w:r>
+    </w:p>
+    <w:p>
+      <w:pPr>
+        <w:pStyle w:val="Judul2"/>
+        <w:rPr>
+          <w:lang w:eastAsia="id-ID"/>
+        </w:rPr>
+      </w:pPr>
+      <w:r>
+        <w:rPr>
+          <w:lang w:eastAsia="id-ID"/>
+        </w:rPr>
+        <w:t>VISUALISASI DATA</w:t>
+      </w:r>
+    </w:p>
+    <w:p>
+      <w:pPr>
+        <w:pStyle w:val="Judul2"/>
+        <w:rPr>
+          <w:lang w:eastAsia="id-ID"/>
+        </w:rPr>
+      </w:pPr>
+      <w:r>
+        <w:rPr>
+          <w:lang w:eastAsia="id-ID"/>
+        </w:rPr>
+        <w:t>ANALISIS DATA</w:t>
+      </w:r>
+    </w:p>
+    <w:p>
+      <w:pPr>
+        <w:pStyle w:val="Judul2"/>
+        <w:rPr>
+          <w:lang w:eastAsia="id-ID"/>
+        </w:rPr>
+      </w:pPr>
+      <w:r>
+        <w:rPr>
+          <w:lang w:eastAsia="id-ID"/>
+        </w:rPr>
+        <w:t>INSIGHT</w:t>
+      </w:r>
+    </w:p>
+    <w:p>
+      <w:pPr>
+        <w:spacing w:after="160" w:line="259" w:lineRule="auto"/>
+        <w:ind w:firstLine="0"/>
+        <w:jc w:val="left"/>
+        <w:rPr>
+          <w:rFonts w:eastAsiaTheme="majorEastAsia" w:cstheme="majorBidi"/>
+          <w:b/>
+          <w:color w:val="000000" w:themeColor="text1"/>
+          <w:szCs w:val="26"/>
+          <w:lang w:eastAsia="id-ID"/>
+        </w:rPr>
+      </w:pPr>
+      <w:r>
+        <w:rPr>
+          <w:lang w:eastAsia="id-ID"/>
+        </w:rPr>
+        <w:br w:type="page"/>
+      </w:r>
+    </w:p>
+    <w:p>
+      <w:pPr>
+        <w:pStyle w:val="Judul1"/>
+        <w:ind w:left="0" w:firstLine="0"/>
+        <w:jc w:val="center"/>
+        <w:rPr>
+          <w:lang w:eastAsia="id-ID"/>
+        </w:rPr>
+      </w:pPr>
+      <w:r>
+        <w:rPr>
+          <w:lang w:eastAsia="id-ID"/>
+        </w:rPr>
+        <w:lastRenderedPageBreak/>
+        <w:br/>
+        <w:t>PENUTUP</w:t>
+      </w:r>
+    </w:p>
+    <w:p>
+      <w:pPr>
+        <w:pStyle w:val="Judul2"/>
+        <w:rPr>
+          <w:lang w:eastAsia="id-ID"/>
+        </w:rPr>
+      </w:pPr>
+      <w:r>
+        <w:rPr>
+          <w:lang w:eastAsia="id-ID"/>
+        </w:rPr>
+        <w:t>KESIMPULAN</w:t>
       </w:r>
       <w:r>
         <w:rPr>
@@ -7041,39 +7273,7 @@
       </w:r>
       <w:r>
         <w:tab/>
-        <w:t xml:space="preserve">H. Zhang, Y. Wang, Z. Li, and X. Wang, “Machine Learning Models for Bank Customer Churn Prediction: A Comparative Study of </w:t>
-      </w:r>
-      <w:proofErr w:type="spellStart"/>
-      <w:r>
-        <w:t>LightGBM</w:t>
-      </w:r>
-      <w:proofErr w:type="spellEnd"/>
-      <w:r>
-        <w:t xml:space="preserve">, </w:t>
-      </w:r>
-      <w:proofErr w:type="spellStart"/>
-      <w:r>
-        <w:t>CatBoost</w:t>
-      </w:r>
-      <w:proofErr w:type="spellEnd"/>
-      <w:r>
-        <w:t xml:space="preserve">, and </w:t>
-      </w:r>
-      <w:proofErr w:type="spellStart"/>
-      <w:r>
-        <w:t>XGBoost</w:t>
-      </w:r>
-      <w:proofErr w:type="spellEnd"/>
-      <w:r>
-        <w:t xml:space="preserve">,” Oct. 2025, pp. 6–16. </w:t>
-      </w:r>
-      <w:proofErr w:type="spellStart"/>
-      <w:r>
-        <w:t>doi</w:t>
-      </w:r>
-      <w:proofErr w:type="spellEnd"/>
-      <w:r>
-        <w:t>: 10.1145/3767052.3767054.</w:t>
+        <w:t>H. Zhang, Y. Wang, Z. Li, and X. Wang, “Machine Learning Models for Bank Customer Churn Prediction: A Comparative Study of LightGBM, CatBoost, and XGBoost,” Oct. 2025, pp. 6–16. doi: 10.1145/3767052.3767054.</w:t>
       </w:r>
     </w:p>
     <w:p>
@@ -7101,15 +7301,7 @@
         <w:t>Journal of Services Marketing</w:t>
       </w:r>
       <w:r>
-        <w:t xml:space="preserve">, vol. 39, no. 1, pp. 20–35, Sep. 2024, </w:t>
-      </w:r>
-      <w:proofErr w:type="spellStart"/>
-      <w:r>
-        <w:t>doi</w:t>
-      </w:r>
-      <w:proofErr w:type="spellEnd"/>
-      <w:r>
-        <w:t>: 10.1108/JSM-04-2024-0156.</w:t>
+        <w:t>, vol. 39, no. 1, pp. 20–35, Sep. 2024, doi: 10.1108/JSM-04-2024-0156.</w:t>
       </w:r>
     </w:p>
     <w:p>
@@ -7127,84 +7319,17 @@
       </w:r>
       <w:r>
         <w:tab/>
-        <w:t xml:space="preserve">M. Basri, “A Comparative </w:t>
-      </w:r>
-      <w:proofErr w:type="gramStart"/>
-      <w:r>
-        <w:t>Study :</w:t>
-      </w:r>
-      <w:proofErr w:type="gramEnd"/>
-      <w:r>
-        <w:t xml:space="preserve"> Predicting Customer Churn in Banking Using Logistic Regression &amp; Random Forest,” </w:t>
-      </w:r>
-      <w:proofErr w:type="spellStart"/>
-      <w:proofErr w:type="gramStart"/>
+        <w:t xml:space="preserve">M. Basri, “A Comparative Study : Predicting Customer Churn in Banking Using Logistic Regression &amp; Random Forest,” </w:t>
+      </w:r>
       <w:r>
         <w:rPr>
           <w:i/>
           <w:iCs/>
         </w:rPr>
-        <w:t>Ultimatics</w:t>
-      </w:r>
-      <w:proofErr w:type="spellEnd"/>
-      <w:r>
-        <w:rPr>
-          <w:i/>
-          <w:iCs/>
-        </w:rPr>
-        <w:t> :</w:t>
-      </w:r>
-      <w:proofErr w:type="gramEnd"/>
-      <w:r>
-        <w:rPr>
-          <w:i/>
-          <w:iCs/>
-        </w:rPr>
-        <w:t xml:space="preserve"> </w:t>
-      </w:r>
-      <w:proofErr w:type="spellStart"/>
-      <w:r>
-        <w:rPr>
-          <w:i/>
-          <w:iCs/>
-        </w:rPr>
-        <w:t>Jurnal</w:t>
-      </w:r>
-      <w:proofErr w:type="spellEnd"/>
-      <w:r>
-        <w:rPr>
-          <w:i/>
-          <w:iCs/>
-        </w:rPr>
-        <w:t xml:space="preserve"> Teknik </w:t>
-      </w:r>
-      <w:proofErr w:type="spellStart"/>
-      <w:r>
-        <w:rPr>
-          <w:i/>
-          <w:iCs/>
-        </w:rPr>
-        <w:t>Informatika</w:t>
-      </w:r>
-      <w:proofErr w:type="spellEnd"/>
-      <w:r>
-        <w:t xml:space="preserve">, vol. 17, no. 1, pp. 72–81, Jun. 2025, </w:t>
-      </w:r>
-      <w:proofErr w:type="spellStart"/>
-      <w:r>
-        <w:t>doi</w:t>
-      </w:r>
-      <w:proofErr w:type="spellEnd"/>
-      <w:r>
-        <w:t>: 10.31937/</w:t>
-      </w:r>
-      <w:proofErr w:type="gramStart"/>
-      <w:r>
-        <w:t>ti.v</w:t>
-      </w:r>
-      <w:proofErr w:type="gramEnd"/>
-      <w:r>
-        <w:t>17i1.4075.</w:t>
+        <w:t>Ultimatics : Jurnal Teknik Informatika</w:t>
+      </w:r>
+      <w:r>
+        <w:t>, vol. 17, no. 1, pp. 72–81, Jun. 2025, doi: 10.31937/ti.v17i1.4075.</w:t>
       </w:r>
     </w:p>
     <w:p>
@@ -7222,83 +7347,17 @@
       </w:r>
       <w:r>
         <w:tab/>
-        <w:t xml:space="preserve">R. Rivaldo, R. Taufik, I. S. </w:t>
-      </w:r>
-      <w:proofErr w:type="spellStart"/>
-      <w:r>
-        <w:t>Ilman</w:t>
-      </w:r>
-      <w:proofErr w:type="spellEnd"/>
-      <w:r>
-        <w:t xml:space="preserve">, and O. D. E. Wulansari, “A Comparative Study of </w:t>
-      </w:r>
-      <w:proofErr w:type="spellStart"/>
-      <w:r>
-        <w:t>XGBoost</w:t>
-      </w:r>
-      <w:proofErr w:type="spellEnd"/>
-      <w:r>
-        <w:t xml:space="preserve">, </w:t>
-      </w:r>
-      <w:proofErr w:type="spellStart"/>
-      <w:r>
-        <w:t>LightGBM</w:t>
-      </w:r>
-      <w:proofErr w:type="spellEnd"/>
-      <w:r>
-        <w:t xml:space="preserve">, and </w:t>
-      </w:r>
-      <w:proofErr w:type="spellStart"/>
-      <w:r>
-        <w:t>CatBoost</w:t>
-      </w:r>
-      <w:proofErr w:type="spellEnd"/>
-      <w:r>
-        <w:t xml:space="preserve"> Models for Customer Churn Prediction in the Banking Industry,” </w:t>
-      </w:r>
-      <w:proofErr w:type="spellStart"/>
+        <w:t xml:space="preserve">R. Rivaldo, R. Taufik, I. S. Ilman, and O. D. E. Wulansari, “A Comparative Study of XGBoost, LightGBM, and CatBoost Models for Customer Churn Prediction in the Banking Industry,” </w:t>
+      </w:r>
       <w:r>
         <w:rPr>
           <w:i/>
           <w:iCs/>
         </w:rPr>
-        <w:t>Jurnal</w:t>
-      </w:r>
-      <w:proofErr w:type="spellEnd"/>
-      <w:r>
-        <w:rPr>
-          <w:i/>
-          <w:iCs/>
-        </w:rPr>
-        <w:t xml:space="preserve"> </w:t>
-      </w:r>
-      <w:proofErr w:type="spellStart"/>
-      <w:r>
-        <w:rPr>
-          <w:i/>
-          <w:iCs/>
-        </w:rPr>
-        <w:t>Pepadun</w:t>
-      </w:r>
-      <w:proofErr w:type="spellEnd"/>
-      <w:r>
-        <w:t xml:space="preserve">, vol. 6, no. 2, pp. 178–187, Aug. 2025, </w:t>
-      </w:r>
-      <w:proofErr w:type="spellStart"/>
-      <w:r>
-        <w:t>doi</w:t>
-      </w:r>
-      <w:proofErr w:type="spellEnd"/>
-      <w:r>
-        <w:t>: 10.23960/</w:t>
-      </w:r>
-      <w:proofErr w:type="gramStart"/>
-      <w:r>
-        <w:t>pepadun.v</w:t>
-      </w:r>
-      <w:proofErr w:type="gramEnd"/>
-      <w:r>
-        <w:t>6i2.277.</w:t>
+        <w:t>Jurnal Pepadun</w:t>
+      </w:r>
+      <w:r>
+        <w:t>, vol. 6, no. 2, pp. 178–187, Aug. 2025, doi: 10.23960/pepadun.v6i2.277.</w:t>
       </w:r>
     </w:p>
     <w:p>
@@ -7326,15 +7385,7 @@
         <w:t>Journal of Services Marketing</w:t>
       </w:r>
       <w:r>
-        <w:t xml:space="preserve">, vol. 39, no. 1, pp. 20–35, Sep. 2024, </w:t>
-      </w:r>
-      <w:proofErr w:type="spellStart"/>
-      <w:r>
-        <w:t>doi</w:t>
-      </w:r>
-      <w:proofErr w:type="spellEnd"/>
-      <w:r>
-        <w:t>: 10.1108/JSM-04-2024-0156.</w:t>
+        <w:t>, vol. 39, no. 1, pp. 20–35, Sep. 2024, doi: 10.1108/JSM-04-2024-0156.</w:t>
       </w:r>
     </w:p>
     <w:p>
@@ -7352,15 +7403,7 @@
       </w:r>
       <w:r>
         <w:tab/>
-        <w:t xml:space="preserve">Y. Qi, “Bank Customer Churn Prediction Based on Multi-stage Machine Learning: Integrating Data Quality Enhancement, SHAP Feature Insight, and </w:t>
-      </w:r>
-      <w:proofErr w:type="spellStart"/>
-      <w:r>
-        <w:t>LightGBM</w:t>
-      </w:r>
-      <w:proofErr w:type="spellEnd"/>
-      <w:r>
-        <w:t xml:space="preserve"> Optimization,” </w:t>
+        <w:t xml:space="preserve">Y. Qi, “Bank Customer Churn Prediction Based on Multi-stage Machine Learning: Integrating Data Quality Enhancement, SHAP Feature Insight, and LightGBM Optimization,” </w:t>
       </w:r>
       <w:r>
         <w:rPr>
@@ -7370,15 +7413,7 @@
         <w:t>Highlights in Business, Economics and Management</w:t>
       </w:r>
       <w:r>
-        <w:t xml:space="preserve">, vol. 65, pp. 455–459, Dec. 2025, </w:t>
-      </w:r>
-      <w:proofErr w:type="spellStart"/>
-      <w:r>
-        <w:t>doi</w:t>
-      </w:r>
-      <w:proofErr w:type="spellEnd"/>
-      <w:r>
-        <w:t>: 10.54097/055y1366.</w:t>
+        <w:t>, vol. 65, pp. 455–459, Dec. 2025, doi: 10.54097/055y1366.</w:t>
       </w:r>
     </w:p>
     <w:p>
@@ -7398,7 +7433,6 @@
         <w:tab/>
         <w:t xml:space="preserve">J. Maan and H. Maan, “Customer Churn Prediction Model using Explainable Machine Learning,” Mar. 02, 2023, </w:t>
       </w:r>
-      <w:proofErr w:type="spellStart"/>
       <w:r>
         <w:rPr>
           <w:i/>
@@ -7406,17 +7440,8 @@
         </w:rPr>
         <w:t>arXiv</w:t>
       </w:r>
-      <w:proofErr w:type="spellEnd"/>
-      <w:r>
-        <w:t xml:space="preserve">: arXiv:2303.00960. </w:t>
-      </w:r>
-      <w:proofErr w:type="spellStart"/>
-      <w:r>
-        <w:t>doi</w:t>
-      </w:r>
-      <w:proofErr w:type="spellEnd"/>
-      <w:r>
-        <w:t>: 10.48550/arXiv.2303.00960.</w:t>
+      <w:r>
+        <w:t>: arXiv:2303.00960. doi: 10.48550/arXiv.2303.00960.</w:t>
       </w:r>
     </w:p>
     <w:p>
@@ -7438,7 +7463,6 @@
       </w:pPr>
     </w:p>
     <w:sectPr>
-      <w:footerReference w:type="default" r:id="rId9"/>
       <w:pgSz w:w="12240" w:h="15840"/>
       <w:pgMar w:top="1701" w:right="1701" w:bottom="1701" w:left="2268" w:header="709" w:footer="709" w:gutter="0"/>
       <w:pgNumType w:start="1"/>
@@ -7478,7 +7502,7 @@
 <w:ftr xmlns:wpc="http://schemas.microsoft.com/office/word/2010/wordprocessingCanvas" xmlns:cx="http://schemas.microsoft.com/office/drawing/2014/chartex" xmlns:cx1="http://schemas.microsoft.com/office/drawing/2015/9/8/chartex" xmlns:cx2="http://schemas.microsoft.com/office/drawing/2015/10/21/chartex" xmlns:cx3="http://schemas.microsoft.com/office/drawing/2016/5/9/chartex" xmlns:cx4="http://schemas.microsoft.com/office/drawing/2016/5/10/chartex" xmlns:cx5="http://schemas.microsoft.com/office/drawing/2016/5/11/chartex" xmlns:cx6="http://schemas.microsoft.com/office/drawing/2016/5/12/chartex" xmlns:cx7="http://schemas.microsoft.com/office/drawing/2016/5/13/chartex" xmlns:cx8="http://schemas.microsoft.com/office/drawing/2016/5/14/chartex" xmlns:mc="http://schemas.openxmlformats.org/markup-compatibility/2006" xmlns:aink="http://schemas.microsoft.com/office/drawing/2016/ink" xmlns:am3d="http://schemas.microsoft.com/office/drawing/2017/model3d" xmlns:o="urn:schemas-microsoft-com:office:office" xmlns:oel="http://schemas.microsoft.com/office/2019/extlst" xmlns:r="http://schemas.openxmlformats.org/officeDocument/2006/relationships" xmlns:m="http://schemas.openxmlformats.org/officeDocument/2006/math" xmlns:v="urn:schemas-microsoft-com:vml" xmlns:wp14="http://schemas.microsoft.com/office/word/2010/wordprocessingDrawing" xmlns:wp="http://schemas.openxmlformats.org/drawingml/2006/wordprocessingDrawing" xmlns:w10="urn:schemas-microsoft-com:office:word" xmlns:w="http://schemas.openxmlformats.org/wordprocessingml/2006/main" xmlns:w14="http://schemas.microsoft.com/office/word/2010/wordml" xmlns:w15="http://schemas.microsoft.com/office/word/2012/wordml" xmlns:w16cex="http://schemas.microsoft.com/office/word/2018/wordml/cex" xmlns:w16cid="http://schemas.microsoft.com/office/word/2016/wordml/cid" xmlns:w16="http://schemas.microsoft.com/office/word/2018/wordml" xmlns:w16du="http://schemas.microsoft.com/office/word/2023/wordml/word16du" xmlns:w16sdtdh="http://schemas.microsoft.com/office/word/2020/wordml/sdtdatahash" xmlns:w16sdtfl="http://schemas.microsoft.com/office/word/2024/wordml/sdtformatlock" xmlns:w16se="http://schemas.microsoft.com/office/word/2015/wordml/symex" xmlns:wpg="http://schemas.microsoft.com/office/word/2010/wordprocessingGroup" xmlns:wpi="http://schemas.microsoft.com/office/word/2010/wordprocessingInk" xmlns:wne="http://schemas.microsoft.com/office/word/2006/wordml" xmlns:wps="http://schemas.microsoft.com/office/word/2010/wordprocessingShape" mc:Ignorable="w14 w15 w16se w16cid w16 w16cex w16sdtdh w16sdtfl w16du wp14">
   <w:sdt>
     <w:sdtPr>
-      <w:id w:val="-1140258873"/>
+      <w:id w:val="1849357791"/>
       <w:docPartObj>
         <w:docPartGallery w:val="Page Numbers (Bottom of Page)"/>
         <w:docPartUnique/>
@@ -7490,12 +7514,24 @@
           <w:pStyle w:val="Footer"/>
           <w:jc w:val="right"/>
         </w:pPr>
-      </w:p>
-      <w:p>
-        <w:pPr>
-          <w:pStyle w:val="Footer"/>
-          <w:jc w:val="right"/>
-        </w:pPr>
+        <w:r>
+          <w:fldChar w:fldCharType="begin"/>
+        </w:r>
+        <w:r>
+          <w:instrText>PAGE   \* MERGEFORMAT</w:instrText>
+        </w:r>
+        <w:r>
+          <w:fldChar w:fldCharType="separate"/>
+        </w:r>
+        <w:r>
+          <w:rPr>
+            <w:lang w:val="id-ID"/>
+          </w:rPr>
+          <w:t>2</w:t>
+        </w:r>
+        <w:r>
+          <w:fldChar w:fldCharType="end"/>
+        </w:r>
       </w:p>
     </w:sdtContent>
   </w:sdt>
@@ -12971,6 +13007,7 @@
   <w:style w:type="character" w:default="1" w:styleId="FontParagrafDefault">
     <w:name w:val="Default Paragraph Font"/>
     <w:uiPriority w:val="1"/>
+    <w:semiHidden/>
     <w:unhideWhenUsed/>
   </w:style>
   <w:style w:type="table" w:default="1" w:styleId="TabelNormal">

</xml_diff>